<commit_message>
Update schedule dates for document creation and spreadsheet courses
- Changed the date for Document Creation (1) and (2) from September 1 (Monday) to September 1 (Tuesday).
- Updated the dates for Spreadsheet courses (3), (4), (5), and Software Integration from September 24 (Monday) and October 1 (Monday) to September 24 (Thursday) and October 1 (Thursday) respectively.
</commit_message>
<xml_diff>
--- a/情報科学演習/20260714_01_02/20250714情報科学演習0102（基本操作・ネットワークの仕組みと基本）.docx
+++ b/情報科学演習/20260714_01_02/20250714情報科学演習0102（基本操作・ネットワークの仕組みと基本）.docx
@@ -1,6 +1,6 @@
 
 <file path=word/document.xml><?xml version="1.0" encoding="utf-8"?>
-<w:document xmlns:wpc="http://schemas.microsoft.com/office/word/2010/wordprocessingCanvas" xmlns:cx="http://schemas.microsoft.com/office/drawing/2014/chartex" xmlns:cx1="http://schemas.microsoft.com/office/drawing/2015/9/8/chartex" xmlns:cx2="http://schemas.microsoft.com/office/drawing/2015/10/21/chartex" xmlns:cx3="http://schemas.microsoft.com/office/drawing/2016/5/9/chartex" xmlns:cx4="http://schemas.microsoft.com/office/drawing/2016/5/10/chartex" xmlns:cx5="http://schemas.microsoft.com/office/drawing/2016/5/11/chartex" xmlns:cx6="http://schemas.microsoft.com/office/drawing/2016/5/12/chartex" xmlns:cx7="http://schemas.microsoft.com/office/drawing/2016/5/13/chartex" xmlns:cx8="http://schemas.microsoft.com/office/drawing/2016/5/14/chartex" xmlns:mc="http://schemas.openxmlformats.org/markup-compatibility/2006" xmlns:m="http://schemas.openxmlformats.org/officeDocument/2006/math" xmlns:aink="http://schemas.microsoft.com/office/drawing/2016/ink" xmlns:am3d="http://schemas.microsoft.com/office/drawing/2017/model3d" xmlns:oel="http://schemas.microsoft.com/office/2019/extlst" xmlns:r="http://schemas.openxmlformats.org/officeDocument/2006/relationships" xmlns:wp14="http://schemas.microsoft.com/office/word/2010/wordprocessingDrawing" xmlns:wp="http://schemas.openxmlformats.org/drawingml/2006/wordprocessingDrawing" xmlns:wpg="http://schemas.microsoft.com/office/word/2010/wordprocessingGroup" xmlns:wpi="http://schemas.microsoft.com/office/word/2010/wordprocessingInk" xmlns:wps="http://schemas.microsoft.com/office/word/2010/wordprocessingShape" xmlns:o="urn:schemas-microsoft-com:office:office" xmlns:v="urn:schemas-microsoft-com:vml" xmlns:w10="urn:schemas-microsoft-com:office:word" xmlns:w="http://schemas.openxmlformats.org/wordprocessingml/2006/main" xmlns:w14="http://schemas.microsoft.com/office/word/2010/wordml" xmlns:w15="http://schemas.microsoft.com/office/word/2012/wordml" xmlns:w16cex="http://schemas.microsoft.com/office/word/2018/wordml/cex" xmlns:w16cid="http://schemas.microsoft.com/office/word/2016/wordml/cid" xmlns:w16="http://schemas.microsoft.com/office/word/2018/wordml" xmlns:w16sdtdh="http://schemas.microsoft.com/office/word/2020/wordml/sdtdatahash" xmlns:w16sdtfl="http://schemas.microsoft.com/office/word/2024/wordml/sdtformatlock" xmlns:w16se="http://schemas.microsoft.com/office/word/2015/wordml/symex" xmlns:w16du="http://schemas.microsoft.com/office/word/2023/wordml/word16du" xmlns:wne="http://schemas.microsoft.com/office/word/2006/wordml" mc:Ignorable="w14 w15 w16se w16cid w16 w16cex w16sdtdh w16sdtfl w16du wp14">
+<w:document xmlns:wpc="http://schemas.microsoft.com/office/word/2010/wordprocessingCanvas" xmlns:cx="http://schemas.microsoft.com/office/drawing/2014/chartex" xmlns:cx1="http://schemas.microsoft.com/office/drawing/2015/9/8/chartex" xmlns:cx2="http://schemas.microsoft.com/office/drawing/2015/10/21/chartex" xmlns:cx3="http://schemas.microsoft.com/office/drawing/2016/5/9/chartex" xmlns:cx4="http://schemas.microsoft.com/office/drawing/2016/5/10/chartex" xmlns:cx5="http://schemas.microsoft.com/office/drawing/2016/5/11/chartex" xmlns:cx6="http://schemas.microsoft.com/office/drawing/2016/5/12/chartex" xmlns:cx7="http://schemas.microsoft.com/office/drawing/2016/5/13/chartex" xmlns:cx8="http://schemas.microsoft.com/office/drawing/2016/5/14/chartex" xmlns:mc="http://schemas.openxmlformats.org/markup-compatibility/2006" xmlns:aink="http://schemas.microsoft.com/office/drawing/2016/ink" xmlns:am3d="http://schemas.microsoft.com/office/drawing/2017/model3d" xmlns:o="urn:schemas-microsoft-com:office:office" xmlns:oel="http://schemas.microsoft.com/office/2019/extlst" xmlns:r="http://schemas.openxmlformats.org/officeDocument/2006/relationships" xmlns:m="http://schemas.openxmlformats.org/officeDocument/2006/math" xmlns:v="urn:schemas-microsoft-com:vml" xmlns:wp14="http://schemas.microsoft.com/office/word/2010/wordprocessingDrawing" xmlns:wp="http://schemas.openxmlformats.org/drawingml/2006/wordprocessingDrawing" xmlns:w10="urn:schemas-microsoft-com:office:word" xmlns:w="http://schemas.openxmlformats.org/wordprocessingml/2006/main" xmlns:w14="http://schemas.microsoft.com/office/word/2010/wordml" xmlns:w15="http://schemas.microsoft.com/office/word/2012/wordml" xmlns:w16cex="http://schemas.microsoft.com/office/word/2018/wordml/cex" xmlns:w16cid="http://schemas.microsoft.com/office/word/2016/wordml/cid" xmlns:w16="http://schemas.microsoft.com/office/word/2018/wordml" xmlns:w16du="http://schemas.microsoft.com/office/word/2023/wordml/word16du" xmlns:w16sdtdh="http://schemas.microsoft.com/office/word/2020/wordml/sdtdatahash" xmlns:w16sdtfl="http://schemas.microsoft.com/office/word/2024/wordml/sdtformatlock" xmlns:w16se="http://schemas.microsoft.com/office/word/2015/wordml/symex" xmlns:wpg="http://schemas.microsoft.com/office/word/2010/wordprocessingGroup" xmlns:wpi="http://schemas.microsoft.com/office/word/2010/wordprocessingInk" xmlns:wne="http://schemas.microsoft.com/office/word/2006/wordml" xmlns:wps="http://schemas.microsoft.com/office/word/2010/wordprocessingShape" mc:Ignorable="w14 w15 w16se w16cid w16 w16cex w16sdtdh w16sdtfl w16du wp14">
   <w:body>
     <w:p>
       <w:pPr>
@@ -532,9 +532,9 @@
       </w:r>
       <w:r>
         <w:rPr>
-          <w:rFonts w:asciiTheme="minorHAnsi" w:eastAsiaTheme="minorEastAsia" w:hAnsiTheme="minorHAnsi"/>
-        </w:rPr>
-        <w:t>月</w:t>
+          <w:rFonts w:asciiTheme="minorHAnsi" w:eastAsiaTheme="minorEastAsia" w:hAnsiTheme="minorHAnsi" w:hint="eastAsia"/>
+        </w:rPr>
+        <w:t>火</w:t>
       </w:r>
       <w:r>
         <w:rPr>
@@ -683,9 +683,9 @@
       </w:r>
       <w:r>
         <w:rPr>
-          <w:rFonts w:asciiTheme="minorHAnsi" w:eastAsiaTheme="minorEastAsia" w:hAnsiTheme="minorHAnsi"/>
-        </w:rPr>
-        <w:t>月</w:t>
+          <w:rFonts w:asciiTheme="minorHAnsi" w:eastAsiaTheme="minorEastAsia" w:hAnsiTheme="minorHAnsi" w:hint="eastAsia"/>
+        </w:rPr>
+        <w:t>火</w:t>
       </w:r>
       <w:r>
         <w:rPr>
@@ -1420,9 +1420,9 @@
       </w:r>
       <w:r>
         <w:rPr>
-          <w:rFonts w:asciiTheme="minorHAnsi" w:eastAsiaTheme="minorEastAsia" w:hAnsiTheme="minorHAnsi"/>
-        </w:rPr>
-        <w:t>月</w:t>
+          <w:rFonts w:asciiTheme="minorHAnsi" w:eastAsiaTheme="minorEastAsia" w:hAnsiTheme="minorHAnsi" w:hint="eastAsia"/>
+        </w:rPr>
+        <w:t>木</w:t>
       </w:r>
       <w:r>
         <w:rPr>
@@ -1565,9 +1565,9 @@
       </w:r>
       <w:r>
         <w:rPr>
-          <w:rFonts w:asciiTheme="minorHAnsi" w:eastAsiaTheme="minorEastAsia" w:hAnsiTheme="minorHAnsi"/>
-        </w:rPr>
-        <w:t>月</w:t>
+          <w:rFonts w:asciiTheme="minorHAnsi" w:eastAsiaTheme="minorEastAsia" w:hAnsiTheme="minorHAnsi" w:hint="eastAsia"/>
+        </w:rPr>
+        <w:t>木</w:t>
       </w:r>
       <w:r>
         <w:rPr>
@@ -1716,9 +1716,9 @@
       </w:r>
       <w:r>
         <w:rPr>
-          <w:rFonts w:asciiTheme="minorHAnsi" w:eastAsiaTheme="minorEastAsia" w:hAnsiTheme="minorHAnsi"/>
-        </w:rPr>
-        <w:t>月</w:t>
+          <w:rFonts w:asciiTheme="minorHAnsi" w:eastAsiaTheme="minorEastAsia" w:hAnsiTheme="minorHAnsi" w:hint="eastAsia"/>
+        </w:rPr>
+        <w:t>木</w:t>
       </w:r>
       <w:r>
         <w:rPr>
@@ -1861,9 +1861,9 @@
       </w:r>
       <w:r>
         <w:rPr>
-          <w:rFonts w:asciiTheme="minorHAnsi" w:eastAsiaTheme="minorEastAsia" w:hAnsiTheme="minorHAnsi"/>
-        </w:rPr>
-        <w:t>月</w:t>
+          <w:rFonts w:asciiTheme="minorHAnsi" w:eastAsiaTheme="minorEastAsia" w:hAnsiTheme="minorHAnsi" w:hint="eastAsia"/>
+        </w:rPr>
+        <w:t>木</w:t>
       </w:r>
       <w:r>
         <w:rPr>
@@ -2207,76 +2207,94 @@
       <w:pPr>
         <w:rPr>
           <w:rFonts w:asciiTheme="minorHAnsi" w:eastAsiaTheme="majorEastAsia" w:hAnsiTheme="minorHAnsi"/>
+          <w:lang w:eastAsia="zh-TW"/>
         </w:rPr>
       </w:pPr>
       <w:r>
         <w:rPr>
           <w:rFonts w:asciiTheme="minorHAnsi" w:eastAsiaTheme="majorEastAsia" w:hAnsiTheme="minorHAnsi"/>
+          <w:lang w:eastAsia="zh-TW"/>
         </w:rPr>
         <w:t>情報科学演習　第</w:t>
       </w:r>
       <w:r>
         <w:rPr>
           <w:rFonts w:asciiTheme="minorHAnsi" w:eastAsiaTheme="majorEastAsia" w:hAnsiTheme="minorHAnsi"/>
+          <w:lang w:eastAsia="zh-TW"/>
         </w:rPr>
         <w:t>01</w:t>
       </w:r>
       <w:r>
         <w:rPr>
           <w:rFonts w:asciiTheme="minorHAnsi" w:eastAsiaTheme="majorEastAsia" w:hAnsiTheme="minorHAnsi"/>
+          <w:lang w:eastAsia="zh-TW"/>
         </w:rPr>
         <w:t>回</w:t>
       </w:r>
       <w:r>
         <w:rPr>
           <w:rFonts w:asciiTheme="minorHAnsi" w:eastAsiaTheme="majorEastAsia" w:hAnsiTheme="minorHAnsi"/>
+          <w:lang w:eastAsia="zh-TW"/>
         </w:rPr>
         <w:t xml:space="preserve">　</w:t>
       </w:r>
       <w:r>
         <w:rPr>
           <w:rFonts w:asciiTheme="minorHAnsi" w:eastAsiaTheme="majorEastAsia" w:hAnsiTheme="minorHAnsi"/>
+          <w:lang w:eastAsia="zh-TW"/>
         </w:rPr>
         <w:t>202</w:t>
       </w:r>
       <w:r>
         <w:rPr>
           <w:rFonts w:asciiTheme="minorHAnsi" w:eastAsiaTheme="majorEastAsia" w:hAnsiTheme="minorHAnsi"/>
+          <w:lang w:eastAsia="zh-TW"/>
         </w:rPr>
         <w:t>6</w:t>
       </w:r>
       <w:r>
         <w:rPr>
           <w:rFonts w:asciiTheme="minorHAnsi" w:eastAsiaTheme="majorEastAsia" w:hAnsiTheme="minorHAnsi"/>
+          <w:lang w:eastAsia="zh-TW"/>
         </w:rPr>
         <w:t>/0</w:t>
       </w:r>
       <w:r>
         <w:rPr>
           <w:rFonts w:asciiTheme="minorHAnsi" w:eastAsiaTheme="majorEastAsia" w:hAnsiTheme="minorHAnsi"/>
+          <w:lang w:eastAsia="zh-TW"/>
         </w:rPr>
         <w:t>7</w:t>
       </w:r>
       <w:r>
         <w:rPr>
           <w:rFonts w:asciiTheme="minorHAnsi" w:eastAsiaTheme="majorEastAsia" w:hAnsiTheme="minorHAnsi"/>
+          <w:lang w:eastAsia="zh-TW"/>
         </w:rPr>
         <w:t>/</w:t>
       </w:r>
       <w:r>
         <w:rPr>
           <w:rFonts w:asciiTheme="minorHAnsi" w:eastAsiaTheme="majorEastAsia" w:hAnsiTheme="minorHAnsi"/>
+          <w:lang w:eastAsia="zh-TW"/>
         </w:rPr>
         <w:t>1</w:t>
       </w:r>
       <w:r>
         <w:rPr>
           <w:rFonts w:asciiTheme="minorHAnsi" w:eastAsiaTheme="majorEastAsia" w:hAnsiTheme="minorHAnsi"/>
+          <w:lang w:eastAsia="zh-TW"/>
         </w:rPr>
         <w:t>4</w:t>
       </w:r>
     </w:p>
-    <w:p/>
+    <w:p>
+      <w:pPr>
+        <w:rPr>
+          <w:lang w:eastAsia="zh-TW"/>
+        </w:rPr>
+      </w:pPr>
+    </w:p>
     <w:p>
       <w:pPr>
         <w:rPr>
@@ -3104,50 +3122,88 @@
       </w:pPr>
     </w:p>
     <w:p>
+      <w:pPr>
+        <w:rPr>
+          <w:lang w:eastAsia="zh-TW"/>
+        </w:rPr>
+      </w:pPr>
       <w:r>
         <w:rPr>
           <w:rFonts w:asciiTheme="majorEastAsia" w:eastAsiaTheme="majorEastAsia" w:hAnsiTheme="majorEastAsia"/>
+          <w:lang w:eastAsia="zh-TW"/>
         </w:rPr>
         <w:t>情報科学演習</w:t>
       </w:r>
       <w:r>
+        <w:rPr>
+          <w:lang w:eastAsia="zh-TW"/>
+        </w:rPr>
         <w:t xml:space="preserve">　第</w:t>
       </w:r>
       <w:r>
         <w:rPr>
           <w:rFonts w:hint="eastAsia"/>
+          <w:lang w:eastAsia="zh-TW"/>
         </w:rPr>
         <w:t>02</w:t>
       </w:r>
       <w:r>
         <w:rPr>
           <w:rFonts w:hint="eastAsia"/>
+          <w:lang w:eastAsia="zh-TW"/>
         </w:rPr>
         <w:t xml:space="preserve">回　</w:t>
       </w:r>
       <w:r>
+        <w:rPr>
+          <w:lang w:eastAsia="zh-TW"/>
+        </w:rPr>
         <w:t>202</w:t>
       </w:r>
       <w:r>
+        <w:rPr>
+          <w:lang w:eastAsia="zh-TW"/>
+        </w:rPr>
         <w:t>5</w:t>
       </w:r>
       <w:r>
+        <w:rPr>
+          <w:lang w:eastAsia="zh-TW"/>
+        </w:rPr>
         <w:t>/0</w:t>
       </w:r>
       <w:r>
+        <w:rPr>
+          <w:lang w:eastAsia="zh-TW"/>
+        </w:rPr>
         <w:t>7</w:t>
       </w:r>
       <w:r>
+        <w:rPr>
+          <w:lang w:eastAsia="zh-TW"/>
+        </w:rPr>
         <w:t>/</w:t>
       </w:r>
       <w:r>
+        <w:rPr>
+          <w:lang w:eastAsia="zh-TW"/>
+        </w:rPr>
         <w:t>1</w:t>
       </w:r>
       <w:r>
+        <w:rPr>
+          <w:lang w:eastAsia="zh-TW"/>
+        </w:rPr>
         <w:t>4</w:t>
       </w:r>
     </w:p>
-    <w:p/>
+    <w:p>
+      <w:pPr>
+        <w:rPr>
+          <w:lang w:eastAsia="zh-TW"/>
+        </w:rPr>
+      </w:pPr>
+    </w:p>
     <w:p>
       <w:pPr>
         <w:rPr>
@@ -3414,7 +3470,7 @@
 </file>
 
 <file path=word/endnotes.xml><?xml version="1.0" encoding="utf-8"?>
-<w:endnotes xmlns:wpc="http://schemas.microsoft.com/office/word/2010/wordprocessingCanvas" xmlns:cx="http://schemas.microsoft.com/office/drawing/2014/chartex" xmlns:cx1="http://schemas.microsoft.com/office/drawing/2015/9/8/chartex" xmlns:cx2="http://schemas.microsoft.com/office/drawing/2015/10/21/chartex" xmlns:cx3="http://schemas.microsoft.com/office/drawing/2016/5/9/chartex" xmlns:cx4="http://schemas.microsoft.com/office/drawing/2016/5/10/chartex" xmlns:cx5="http://schemas.microsoft.com/office/drawing/2016/5/11/chartex" xmlns:cx6="http://schemas.microsoft.com/office/drawing/2016/5/12/chartex" xmlns:cx7="http://schemas.microsoft.com/office/drawing/2016/5/13/chartex" xmlns:cx8="http://schemas.microsoft.com/office/drawing/2016/5/14/chartex" xmlns:mc="http://schemas.openxmlformats.org/markup-compatibility/2006" xmlns:m="http://schemas.openxmlformats.org/officeDocument/2006/math" xmlns:aink="http://schemas.microsoft.com/office/drawing/2016/ink" xmlns:am3d="http://schemas.microsoft.com/office/drawing/2017/model3d" xmlns:oel="http://schemas.microsoft.com/office/2019/extlst" xmlns:r="http://schemas.openxmlformats.org/officeDocument/2006/relationships" xmlns:wp14="http://schemas.microsoft.com/office/word/2010/wordprocessingDrawing" xmlns:wp="http://schemas.openxmlformats.org/drawingml/2006/wordprocessingDrawing" xmlns:wpg="http://schemas.microsoft.com/office/word/2010/wordprocessingGroup" xmlns:wpi="http://schemas.microsoft.com/office/word/2010/wordprocessingInk" xmlns:wps="http://schemas.microsoft.com/office/word/2010/wordprocessingShape" xmlns:o="urn:schemas-microsoft-com:office:office" xmlns:v="urn:schemas-microsoft-com:vml" xmlns:w10="urn:schemas-microsoft-com:office:word" xmlns:w="http://schemas.openxmlformats.org/wordprocessingml/2006/main" xmlns:w14="http://schemas.microsoft.com/office/word/2010/wordml" xmlns:w15="http://schemas.microsoft.com/office/word/2012/wordml" xmlns:w16cex="http://schemas.microsoft.com/office/word/2018/wordml/cex" xmlns:w16cid="http://schemas.microsoft.com/office/word/2016/wordml/cid" xmlns:w16="http://schemas.microsoft.com/office/word/2018/wordml" xmlns:w16sdtdh="http://schemas.microsoft.com/office/word/2020/wordml/sdtdatahash" xmlns:w16sdtfl="http://schemas.microsoft.com/office/word/2024/wordml/sdtformatlock" xmlns:w16se="http://schemas.microsoft.com/office/word/2015/wordml/symex" xmlns:w16du="http://schemas.microsoft.com/office/word/2023/wordml/word16du" xmlns:wne="http://schemas.microsoft.com/office/word/2006/wordml" mc:Ignorable="w14 w15 w16se w16cid w16 w16cex w16sdtdh w16sdtfl w16du wp14">
+<w:endnotes xmlns:wpc="http://schemas.microsoft.com/office/word/2010/wordprocessingCanvas" xmlns:cx="http://schemas.microsoft.com/office/drawing/2014/chartex" xmlns:cx1="http://schemas.microsoft.com/office/drawing/2015/9/8/chartex" xmlns:cx2="http://schemas.microsoft.com/office/drawing/2015/10/21/chartex" xmlns:cx3="http://schemas.microsoft.com/office/drawing/2016/5/9/chartex" xmlns:cx4="http://schemas.microsoft.com/office/drawing/2016/5/10/chartex" xmlns:cx5="http://schemas.microsoft.com/office/drawing/2016/5/11/chartex" xmlns:cx6="http://schemas.microsoft.com/office/drawing/2016/5/12/chartex" xmlns:cx7="http://schemas.microsoft.com/office/drawing/2016/5/13/chartex" xmlns:cx8="http://schemas.microsoft.com/office/drawing/2016/5/14/chartex" xmlns:mc="http://schemas.openxmlformats.org/markup-compatibility/2006" xmlns:aink="http://schemas.microsoft.com/office/drawing/2016/ink" xmlns:am3d="http://schemas.microsoft.com/office/drawing/2017/model3d" xmlns:o="urn:schemas-microsoft-com:office:office" xmlns:oel="http://schemas.microsoft.com/office/2019/extlst" xmlns:r="http://schemas.openxmlformats.org/officeDocument/2006/relationships" xmlns:m="http://schemas.openxmlformats.org/officeDocument/2006/math" xmlns:v="urn:schemas-microsoft-com:vml" xmlns:wp14="http://schemas.microsoft.com/office/word/2010/wordprocessingDrawing" xmlns:wp="http://schemas.openxmlformats.org/drawingml/2006/wordprocessingDrawing" xmlns:w10="urn:schemas-microsoft-com:office:word" xmlns:w="http://schemas.openxmlformats.org/wordprocessingml/2006/main" xmlns:w14="http://schemas.microsoft.com/office/word/2010/wordml" xmlns:w15="http://schemas.microsoft.com/office/word/2012/wordml" xmlns:w16cex="http://schemas.microsoft.com/office/word/2018/wordml/cex" xmlns:w16cid="http://schemas.microsoft.com/office/word/2016/wordml/cid" xmlns:w16="http://schemas.microsoft.com/office/word/2018/wordml" xmlns:w16du="http://schemas.microsoft.com/office/word/2023/wordml/word16du" xmlns:w16sdtdh="http://schemas.microsoft.com/office/word/2020/wordml/sdtdatahash" xmlns:w16sdtfl="http://schemas.microsoft.com/office/word/2024/wordml/sdtformatlock" xmlns:w16se="http://schemas.microsoft.com/office/word/2015/wordml/symex" xmlns:wpg="http://schemas.microsoft.com/office/word/2010/wordprocessingGroup" xmlns:wpi="http://schemas.microsoft.com/office/word/2010/wordprocessingInk" xmlns:wne="http://schemas.microsoft.com/office/word/2006/wordml" xmlns:wps="http://schemas.microsoft.com/office/word/2010/wordprocessingShape" mc:Ignorable="w14 w15 w16se w16cid w16 w16cex w16sdtdh w16sdtfl w16du wp14">
   <w:endnote w:type="separator" w:id="-1">
     <w:p>
       <w:r>
@@ -3433,7 +3489,7 @@
 </file>
 
 <file path=word/footer1.xml><?xml version="1.0" encoding="utf-8"?>
-<w:ftr xmlns:wpc="http://schemas.microsoft.com/office/word/2010/wordprocessingCanvas" xmlns:cx="http://schemas.microsoft.com/office/drawing/2014/chartex" xmlns:cx1="http://schemas.microsoft.com/office/drawing/2015/9/8/chartex" xmlns:cx2="http://schemas.microsoft.com/office/drawing/2015/10/21/chartex" xmlns:cx3="http://schemas.microsoft.com/office/drawing/2016/5/9/chartex" xmlns:cx4="http://schemas.microsoft.com/office/drawing/2016/5/10/chartex" xmlns:cx5="http://schemas.microsoft.com/office/drawing/2016/5/11/chartex" xmlns:cx6="http://schemas.microsoft.com/office/drawing/2016/5/12/chartex" xmlns:cx7="http://schemas.microsoft.com/office/drawing/2016/5/13/chartex" xmlns:cx8="http://schemas.microsoft.com/office/drawing/2016/5/14/chartex" xmlns:mc="http://schemas.openxmlformats.org/markup-compatibility/2006" xmlns:m="http://schemas.openxmlformats.org/officeDocument/2006/math" xmlns:aink="http://schemas.microsoft.com/office/drawing/2016/ink" xmlns:am3d="http://schemas.microsoft.com/office/drawing/2017/model3d" xmlns:oel="http://schemas.microsoft.com/office/2019/extlst" xmlns:r="http://schemas.openxmlformats.org/officeDocument/2006/relationships" xmlns:wp14="http://schemas.microsoft.com/office/word/2010/wordprocessingDrawing" xmlns:wp="http://schemas.openxmlformats.org/drawingml/2006/wordprocessingDrawing" xmlns:wpg="http://schemas.microsoft.com/office/word/2010/wordprocessingGroup" xmlns:wpi="http://schemas.microsoft.com/office/word/2010/wordprocessingInk" xmlns:wps="http://schemas.microsoft.com/office/word/2010/wordprocessingShape" xmlns:o="urn:schemas-microsoft-com:office:office" xmlns:v="urn:schemas-microsoft-com:vml" xmlns:w10="urn:schemas-microsoft-com:office:word" xmlns:w="http://schemas.openxmlformats.org/wordprocessingml/2006/main" xmlns:w14="http://schemas.microsoft.com/office/word/2010/wordml" xmlns:w15="http://schemas.microsoft.com/office/word/2012/wordml" xmlns:w16cex="http://schemas.microsoft.com/office/word/2018/wordml/cex" xmlns:w16cid="http://schemas.microsoft.com/office/word/2016/wordml/cid" xmlns:w16="http://schemas.microsoft.com/office/word/2018/wordml" xmlns:w16sdtdh="http://schemas.microsoft.com/office/word/2020/wordml/sdtdatahash" xmlns:w16sdtfl="http://schemas.microsoft.com/office/word/2024/wordml/sdtformatlock" xmlns:w16se="http://schemas.microsoft.com/office/word/2015/wordml/symex" xmlns:w16du="http://schemas.microsoft.com/office/word/2023/wordml/word16du" xmlns:wne="http://schemas.microsoft.com/office/word/2006/wordml" mc:Ignorable="w14 w15 w16se w16cid w16 w16cex w16sdtdh w16sdtfl w16du wp14">
+<w:ftr xmlns:wpc="http://schemas.microsoft.com/office/word/2010/wordprocessingCanvas" xmlns:cx="http://schemas.microsoft.com/office/drawing/2014/chartex" xmlns:cx1="http://schemas.microsoft.com/office/drawing/2015/9/8/chartex" xmlns:cx2="http://schemas.microsoft.com/office/drawing/2015/10/21/chartex" xmlns:cx3="http://schemas.microsoft.com/office/drawing/2016/5/9/chartex" xmlns:cx4="http://schemas.microsoft.com/office/drawing/2016/5/10/chartex" xmlns:cx5="http://schemas.microsoft.com/office/drawing/2016/5/11/chartex" xmlns:cx6="http://schemas.microsoft.com/office/drawing/2016/5/12/chartex" xmlns:cx7="http://schemas.microsoft.com/office/drawing/2016/5/13/chartex" xmlns:cx8="http://schemas.microsoft.com/office/drawing/2016/5/14/chartex" xmlns:mc="http://schemas.openxmlformats.org/markup-compatibility/2006" xmlns:aink="http://schemas.microsoft.com/office/drawing/2016/ink" xmlns:am3d="http://schemas.microsoft.com/office/drawing/2017/model3d" xmlns:o="urn:schemas-microsoft-com:office:office" xmlns:oel="http://schemas.microsoft.com/office/2019/extlst" xmlns:r="http://schemas.openxmlformats.org/officeDocument/2006/relationships" xmlns:m="http://schemas.openxmlformats.org/officeDocument/2006/math" xmlns:v="urn:schemas-microsoft-com:vml" xmlns:wp14="http://schemas.microsoft.com/office/word/2010/wordprocessingDrawing" xmlns:wp="http://schemas.openxmlformats.org/drawingml/2006/wordprocessingDrawing" xmlns:w10="urn:schemas-microsoft-com:office:word" xmlns:w="http://schemas.openxmlformats.org/wordprocessingml/2006/main" xmlns:w14="http://schemas.microsoft.com/office/word/2010/wordml" xmlns:w15="http://schemas.microsoft.com/office/word/2012/wordml" xmlns:w16cex="http://schemas.microsoft.com/office/word/2018/wordml/cex" xmlns:w16cid="http://schemas.microsoft.com/office/word/2016/wordml/cid" xmlns:w16="http://schemas.microsoft.com/office/word/2018/wordml" xmlns:w16du="http://schemas.microsoft.com/office/word/2023/wordml/word16du" xmlns:w16sdtdh="http://schemas.microsoft.com/office/word/2020/wordml/sdtdatahash" xmlns:w16sdtfl="http://schemas.microsoft.com/office/word/2024/wordml/sdtformatlock" xmlns:w16se="http://schemas.microsoft.com/office/word/2015/wordml/symex" xmlns:wpg="http://schemas.microsoft.com/office/word/2010/wordprocessingGroup" xmlns:wpi="http://schemas.microsoft.com/office/word/2010/wordprocessingInk" xmlns:wne="http://schemas.microsoft.com/office/word/2006/wordml" xmlns:wps="http://schemas.microsoft.com/office/word/2010/wordprocessingShape" mc:Ignorable="w14 w15 w16se w16cid w16 w16cex w16sdtdh w16sdtfl w16du wp14">
   <w:p>
     <w:pPr>
       <w:pStyle w:val="a7"/>
@@ -3463,7 +3519,7 @@
 </file>
 
 <file path=word/footnotes.xml><?xml version="1.0" encoding="utf-8"?>
-<w:footnotes xmlns:wpc="http://schemas.microsoft.com/office/word/2010/wordprocessingCanvas" xmlns:cx="http://schemas.microsoft.com/office/drawing/2014/chartex" xmlns:cx1="http://schemas.microsoft.com/office/drawing/2015/9/8/chartex" xmlns:cx2="http://schemas.microsoft.com/office/drawing/2015/10/21/chartex" xmlns:cx3="http://schemas.microsoft.com/office/drawing/2016/5/9/chartex" xmlns:cx4="http://schemas.microsoft.com/office/drawing/2016/5/10/chartex" xmlns:cx5="http://schemas.microsoft.com/office/drawing/2016/5/11/chartex" xmlns:cx6="http://schemas.microsoft.com/office/drawing/2016/5/12/chartex" xmlns:cx7="http://schemas.microsoft.com/office/drawing/2016/5/13/chartex" xmlns:cx8="http://schemas.microsoft.com/office/drawing/2016/5/14/chartex" xmlns:mc="http://schemas.openxmlformats.org/markup-compatibility/2006" xmlns:m="http://schemas.openxmlformats.org/officeDocument/2006/math" xmlns:aink="http://schemas.microsoft.com/office/drawing/2016/ink" xmlns:am3d="http://schemas.microsoft.com/office/drawing/2017/model3d" xmlns:oel="http://schemas.microsoft.com/office/2019/extlst" xmlns:r="http://schemas.openxmlformats.org/officeDocument/2006/relationships" xmlns:wp14="http://schemas.microsoft.com/office/word/2010/wordprocessingDrawing" xmlns:wp="http://schemas.openxmlformats.org/drawingml/2006/wordprocessingDrawing" xmlns:wpg="http://schemas.microsoft.com/office/word/2010/wordprocessingGroup" xmlns:wpi="http://schemas.microsoft.com/office/word/2010/wordprocessingInk" xmlns:wps="http://schemas.microsoft.com/office/word/2010/wordprocessingShape" xmlns:o="urn:schemas-microsoft-com:office:office" xmlns:v="urn:schemas-microsoft-com:vml" xmlns:w10="urn:schemas-microsoft-com:office:word" xmlns:w="http://schemas.openxmlformats.org/wordprocessingml/2006/main" xmlns:w14="http://schemas.microsoft.com/office/word/2010/wordml" xmlns:w15="http://schemas.microsoft.com/office/word/2012/wordml" xmlns:w16cex="http://schemas.microsoft.com/office/word/2018/wordml/cex" xmlns:w16cid="http://schemas.microsoft.com/office/word/2016/wordml/cid" xmlns:w16="http://schemas.microsoft.com/office/word/2018/wordml" xmlns:w16sdtdh="http://schemas.microsoft.com/office/word/2020/wordml/sdtdatahash" xmlns:w16sdtfl="http://schemas.microsoft.com/office/word/2024/wordml/sdtformatlock" xmlns:w16se="http://schemas.microsoft.com/office/word/2015/wordml/symex" xmlns:w16du="http://schemas.microsoft.com/office/word/2023/wordml/word16du" xmlns:wne="http://schemas.microsoft.com/office/word/2006/wordml" mc:Ignorable="w14 w15 w16se w16cid w16 w16cex w16sdtdh w16sdtfl w16du wp14">
+<w:footnotes xmlns:wpc="http://schemas.microsoft.com/office/word/2010/wordprocessingCanvas" xmlns:cx="http://schemas.microsoft.com/office/drawing/2014/chartex" xmlns:cx1="http://schemas.microsoft.com/office/drawing/2015/9/8/chartex" xmlns:cx2="http://schemas.microsoft.com/office/drawing/2015/10/21/chartex" xmlns:cx3="http://schemas.microsoft.com/office/drawing/2016/5/9/chartex" xmlns:cx4="http://schemas.microsoft.com/office/drawing/2016/5/10/chartex" xmlns:cx5="http://schemas.microsoft.com/office/drawing/2016/5/11/chartex" xmlns:cx6="http://schemas.microsoft.com/office/drawing/2016/5/12/chartex" xmlns:cx7="http://schemas.microsoft.com/office/drawing/2016/5/13/chartex" xmlns:cx8="http://schemas.microsoft.com/office/drawing/2016/5/14/chartex" xmlns:mc="http://schemas.openxmlformats.org/markup-compatibility/2006" xmlns:aink="http://schemas.microsoft.com/office/drawing/2016/ink" xmlns:am3d="http://schemas.microsoft.com/office/drawing/2017/model3d" xmlns:o="urn:schemas-microsoft-com:office:office" xmlns:oel="http://schemas.microsoft.com/office/2019/extlst" xmlns:r="http://schemas.openxmlformats.org/officeDocument/2006/relationships" xmlns:m="http://schemas.openxmlformats.org/officeDocument/2006/math" xmlns:v="urn:schemas-microsoft-com:vml" xmlns:wp14="http://schemas.microsoft.com/office/word/2010/wordprocessingDrawing" xmlns:wp="http://schemas.openxmlformats.org/drawingml/2006/wordprocessingDrawing" xmlns:w10="urn:schemas-microsoft-com:office:word" xmlns:w="http://schemas.openxmlformats.org/wordprocessingml/2006/main" xmlns:w14="http://schemas.microsoft.com/office/word/2010/wordml" xmlns:w15="http://schemas.microsoft.com/office/word/2012/wordml" xmlns:w16cex="http://schemas.microsoft.com/office/word/2018/wordml/cex" xmlns:w16cid="http://schemas.microsoft.com/office/word/2016/wordml/cid" xmlns:w16="http://schemas.microsoft.com/office/word/2018/wordml" xmlns:w16du="http://schemas.microsoft.com/office/word/2023/wordml/word16du" xmlns:w16sdtdh="http://schemas.microsoft.com/office/word/2020/wordml/sdtdatahash" xmlns:w16sdtfl="http://schemas.microsoft.com/office/word/2024/wordml/sdtformatlock" xmlns:w16se="http://schemas.microsoft.com/office/word/2015/wordml/symex" xmlns:wpg="http://schemas.microsoft.com/office/word/2010/wordprocessingGroup" xmlns:wpi="http://schemas.microsoft.com/office/word/2010/wordprocessingInk" xmlns:wne="http://schemas.microsoft.com/office/word/2006/wordml" xmlns:wps="http://schemas.microsoft.com/office/word/2010/wordprocessingShape" mc:Ignorable="w14 w15 w16se w16cid w16 w16cex w16sdtdh w16sdtfl w16du wp14">
   <w:footnote w:type="separator" w:id="-1">
     <w:p>
       <w:r>
@@ -3482,7 +3538,7 @@
 </file>
 
 <file path=word/header1.xml><?xml version="1.0" encoding="utf-8"?>
-<w:hdr xmlns:wpc="http://schemas.microsoft.com/office/word/2010/wordprocessingCanvas" xmlns:cx="http://schemas.microsoft.com/office/drawing/2014/chartex" xmlns:cx1="http://schemas.microsoft.com/office/drawing/2015/9/8/chartex" xmlns:cx2="http://schemas.microsoft.com/office/drawing/2015/10/21/chartex" xmlns:cx3="http://schemas.microsoft.com/office/drawing/2016/5/9/chartex" xmlns:cx4="http://schemas.microsoft.com/office/drawing/2016/5/10/chartex" xmlns:cx5="http://schemas.microsoft.com/office/drawing/2016/5/11/chartex" xmlns:cx6="http://schemas.microsoft.com/office/drawing/2016/5/12/chartex" xmlns:cx7="http://schemas.microsoft.com/office/drawing/2016/5/13/chartex" xmlns:cx8="http://schemas.microsoft.com/office/drawing/2016/5/14/chartex" xmlns:mc="http://schemas.openxmlformats.org/markup-compatibility/2006" xmlns:m="http://schemas.openxmlformats.org/officeDocument/2006/math" xmlns:aink="http://schemas.microsoft.com/office/drawing/2016/ink" xmlns:am3d="http://schemas.microsoft.com/office/drawing/2017/model3d" xmlns:oel="http://schemas.microsoft.com/office/2019/extlst" xmlns:r="http://schemas.openxmlformats.org/officeDocument/2006/relationships" xmlns:wp14="http://schemas.microsoft.com/office/word/2010/wordprocessingDrawing" xmlns:wp="http://schemas.openxmlformats.org/drawingml/2006/wordprocessingDrawing" xmlns:wpg="http://schemas.microsoft.com/office/word/2010/wordprocessingGroup" xmlns:wpi="http://schemas.microsoft.com/office/word/2010/wordprocessingInk" xmlns:wps="http://schemas.microsoft.com/office/word/2010/wordprocessingShape" xmlns:o="urn:schemas-microsoft-com:office:office" xmlns:v="urn:schemas-microsoft-com:vml" xmlns:w10="urn:schemas-microsoft-com:office:word" xmlns:w="http://schemas.openxmlformats.org/wordprocessingml/2006/main" xmlns:w14="http://schemas.microsoft.com/office/word/2010/wordml" xmlns:w15="http://schemas.microsoft.com/office/word/2012/wordml" xmlns:w16cex="http://schemas.microsoft.com/office/word/2018/wordml/cex" xmlns:w16cid="http://schemas.microsoft.com/office/word/2016/wordml/cid" xmlns:w16="http://schemas.microsoft.com/office/word/2018/wordml" xmlns:w16sdtdh="http://schemas.microsoft.com/office/word/2020/wordml/sdtdatahash" xmlns:w16sdtfl="http://schemas.microsoft.com/office/word/2024/wordml/sdtformatlock" xmlns:w16se="http://schemas.microsoft.com/office/word/2015/wordml/symex" xmlns:w16du="http://schemas.microsoft.com/office/word/2023/wordml/word16du" xmlns:wne="http://schemas.microsoft.com/office/word/2006/wordml" mc:Ignorable="w14 w15 w16se w16cid w16 w16cex w16sdtdh w16sdtfl w16du wp14">
+<w:hdr xmlns:wpc="http://schemas.microsoft.com/office/word/2010/wordprocessingCanvas" xmlns:cx="http://schemas.microsoft.com/office/drawing/2014/chartex" xmlns:cx1="http://schemas.microsoft.com/office/drawing/2015/9/8/chartex" xmlns:cx2="http://schemas.microsoft.com/office/drawing/2015/10/21/chartex" xmlns:cx3="http://schemas.microsoft.com/office/drawing/2016/5/9/chartex" xmlns:cx4="http://schemas.microsoft.com/office/drawing/2016/5/10/chartex" xmlns:cx5="http://schemas.microsoft.com/office/drawing/2016/5/11/chartex" xmlns:cx6="http://schemas.microsoft.com/office/drawing/2016/5/12/chartex" xmlns:cx7="http://schemas.microsoft.com/office/drawing/2016/5/13/chartex" xmlns:cx8="http://schemas.microsoft.com/office/drawing/2016/5/14/chartex" xmlns:mc="http://schemas.openxmlformats.org/markup-compatibility/2006" xmlns:aink="http://schemas.microsoft.com/office/drawing/2016/ink" xmlns:am3d="http://schemas.microsoft.com/office/drawing/2017/model3d" xmlns:o="urn:schemas-microsoft-com:office:office" xmlns:oel="http://schemas.microsoft.com/office/2019/extlst" xmlns:r="http://schemas.openxmlformats.org/officeDocument/2006/relationships" xmlns:m="http://schemas.openxmlformats.org/officeDocument/2006/math" xmlns:v="urn:schemas-microsoft-com:vml" xmlns:wp14="http://schemas.microsoft.com/office/word/2010/wordprocessingDrawing" xmlns:wp="http://schemas.openxmlformats.org/drawingml/2006/wordprocessingDrawing" xmlns:w10="urn:schemas-microsoft-com:office:word" xmlns:w="http://schemas.openxmlformats.org/wordprocessingml/2006/main" xmlns:w14="http://schemas.microsoft.com/office/word/2010/wordml" xmlns:w15="http://schemas.microsoft.com/office/word/2012/wordml" xmlns:w16cex="http://schemas.microsoft.com/office/word/2018/wordml/cex" xmlns:w16cid="http://schemas.microsoft.com/office/word/2016/wordml/cid" xmlns:w16="http://schemas.microsoft.com/office/word/2018/wordml" xmlns:w16du="http://schemas.microsoft.com/office/word/2023/wordml/word16du" xmlns:w16sdtdh="http://schemas.microsoft.com/office/word/2020/wordml/sdtdatahash" xmlns:w16sdtfl="http://schemas.microsoft.com/office/word/2024/wordml/sdtformatlock" xmlns:w16se="http://schemas.microsoft.com/office/word/2015/wordml/symex" xmlns:wpg="http://schemas.microsoft.com/office/word/2010/wordprocessingGroup" xmlns:wpi="http://schemas.microsoft.com/office/word/2010/wordprocessingInk" xmlns:wne="http://schemas.microsoft.com/office/word/2006/wordml" xmlns:wps="http://schemas.microsoft.com/office/word/2010/wordprocessingShape" mc:Ignorable="w14 w15 w16se w16cid w16 w16cex w16sdtdh w16sdtfl w16du wp14">
   <w:p>
     <w:pPr>
       <w:pStyle w:val="a5"/>
@@ -3490,17 +3546,20 @@
       <w:jc w:val="center"/>
       <w:rPr>
         <w:sz w:val="18"/>
+        <w:lang w:eastAsia="zh-TW"/>
       </w:rPr>
     </w:pPr>
     <w:r>
       <w:rPr>
         <w:sz w:val="18"/>
+        <w:lang w:eastAsia="zh-TW"/>
       </w:rPr>
       <w:t>202</w:t>
     </w:r>
     <w:r>
       <w:rPr>
         <w:sz w:val="18"/>
+        <w:lang w:eastAsia="zh-TW"/>
       </w:rPr>
       <w:t>6</w:t>
     </w:r>
@@ -3508,6 +3567,7 @@
       <w:rPr>
         <w:rFonts w:asciiTheme="majorEastAsia" w:eastAsiaTheme="majorEastAsia" w:hAnsiTheme="majorEastAsia"/>
         <w:sz w:val="18"/>
+        <w:lang w:eastAsia="zh-TW"/>
       </w:rPr>
       <w:t>情報科学演習</w:t>
     </w:r>
@@ -3515,6 +3575,7 @@
       <w:rPr>
         <w:rFonts w:hint="eastAsia"/>
         <w:sz w:val="18"/>
+        <w:lang w:eastAsia="zh-TW"/>
       </w:rPr>
       <w:t>01,02</w:t>
     </w:r>
@@ -3522,18 +3583,21 @@
       <w:rPr>
         <w:rFonts w:hint="eastAsia"/>
         <w:sz w:val="18"/>
+        <w:lang w:eastAsia="zh-TW"/>
       </w:rPr>
       <w:t xml:space="preserve">　</w:t>
     </w:r>
     <w:r>
       <w:rPr>
         <w:sz w:val="18"/>
+        <w:lang w:eastAsia="zh-TW"/>
       </w:rPr>
       <w:t xml:space="preserve">　　　　　　　　　　　　　　　　　　　　　　　　　　　　</w:t>
     </w:r>
     <w:r>
       <w:rPr>
         <w:sz w:val="18"/>
+        <w:lang w:eastAsia="zh-TW"/>
       </w:rPr>
       <w:t xml:space="preserve">　</w:t>
     </w:r>
@@ -3541,6 +3605,7 @@
       <w:rPr>
         <w:rFonts w:hint="eastAsia"/>
         <w:sz w:val="18"/>
+        <w:lang w:eastAsia="zh-TW"/>
       </w:rPr>
       <w:t>岡田</w:t>
     </w:r>
@@ -3548,6 +3613,7 @@
       <w:rPr>
         <w:rFonts w:hint="eastAsia"/>
         <w:sz w:val="18"/>
+        <w:lang w:eastAsia="zh-TW"/>
       </w:rPr>
       <w:t>（県立看護科学大学）</w:t>
     </w:r>
@@ -3556,7 +3622,7 @@
 </file>
 
 <file path=word/numbering.xml><?xml version="1.0" encoding="utf-8"?>
-<w:numbering xmlns:wpc="http://schemas.microsoft.com/office/word/2010/wordprocessingCanvas" xmlns:cx="http://schemas.microsoft.com/office/drawing/2014/chartex" xmlns:cx1="http://schemas.microsoft.com/office/drawing/2015/9/8/chartex" xmlns:cx2="http://schemas.microsoft.com/office/drawing/2015/10/21/chartex" xmlns:cx3="http://schemas.microsoft.com/office/drawing/2016/5/9/chartex" xmlns:cx4="http://schemas.microsoft.com/office/drawing/2016/5/10/chartex" xmlns:cx5="http://schemas.microsoft.com/office/drawing/2016/5/11/chartex" xmlns:cx6="http://schemas.microsoft.com/office/drawing/2016/5/12/chartex" xmlns:cx7="http://schemas.microsoft.com/office/drawing/2016/5/13/chartex" xmlns:cx8="http://schemas.microsoft.com/office/drawing/2016/5/14/chartex" xmlns:mc="http://schemas.openxmlformats.org/markup-compatibility/2006" xmlns:m="http://schemas.openxmlformats.org/officeDocument/2006/math" xmlns:aink="http://schemas.microsoft.com/office/drawing/2016/ink" xmlns:am3d="http://schemas.microsoft.com/office/drawing/2017/model3d" xmlns:oel="http://schemas.microsoft.com/office/2019/extlst" xmlns:r="http://schemas.openxmlformats.org/officeDocument/2006/relationships" xmlns:wp14="http://schemas.microsoft.com/office/word/2010/wordprocessingDrawing" xmlns:wp="http://schemas.openxmlformats.org/drawingml/2006/wordprocessingDrawing" xmlns:wpg="http://schemas.microsoft.com/office/word/2010/wordprocessingGroup" xmlns:wpi="http://schemas.microsoft.com/office/word/2010/wordprocessingInk" xmlns:wps="http://schemas.microsoft.com/office/word/2010/wordprocessingShape" xmlns:o="urn:schemas-microsoft-com:office:office" xmlns:v="urn:schemas-microsoft-com:vml" xmlns:w10="urn:schemas-microsoft-com:office:word" xmlns:w="http://schemas.openxmlformats.org/wordprocessingml/2006/main" xmlns:w14="http://schemas.microsoft.com/office/word/2010/wordml" xmlns:w15="http://schemas.microsoft.com/office/word/2012/wordml" xmlns:w16cex="http://schemas.microsoft.com/office/word/2018/wordml/cex" xmlns:w16cid="http://schemas.microsoft.com/office/word/2016/wordml/cid" xmlns:w16="http://schemas.microsoft.com/office/word/2018/wordml" xmlns:w16sdtdh="http://schemas.microsoft.com/office/word/2020/wordml/sdtdatahash" xmlns:w16sdtfl="http://schemas.microsoft.com/office/word/2024/wordml/sdtformatlock" xmlns:w16se="http://schemas.microsoft.com/office/word/2015/wordml/symex" xmlns:w16du="http://schemas.microsoft.com/office/word/2023/wordml/word16du" xmlns:wne="http://schemas.microsoft.com/office/word/2006/wordml" mc:Ignorable="w14 w15 w16se w16cid w16 w16cex w16sdtdh w16sdtfl w16du wp14">
+<w:numbering xmlns:wpc="http://schemas.microsoft.com/office/word/2010/wordprocessingCanvas" xmlns:cx="http://schemas.microsoft.com/office/drawing/2014/chartex" xmlns:cx1="http://schemas.microsoft.com/office/drawing/2015/9/8/chartex" xmlns:cx2="http://schemas.microsoft.com/office/drawing/2015/10/21/chartex" xmlns:cx3="http://schemas.microsoft.com/office/drawing/2016/5/9/chartex" xmlns:cx4="http://schemas.microsoft.com/office/drawing/2016/5/10/chartex" xmlns:cx5="http://schemas.microsoft.com/office/drawing/2016/5/11/chartex" xmlns:cx6="http://schemas.microsoft.com/office/drawing/2016/5/12/chartex" xmlns:cx7="http://schemas.microsoft.com/office/drawing/2016/5/13/chartex" xmlns:cx8="http://schemas.microsoft.com/office/drawing/2016/5/14/chartex" xmlns:mc="http://schemas.openxmlformats.org/markup-compatibility/2006" xmlns:aink="http://schemas.microsoft.com/office/drawing/2016/ink" xmlns:am3d="http://schemas.microsoft.com/office/drawing/2017/model3d" xmlns:o="urn:schemas-microsoft-com:office:office" xmlns:oel="http://schemas.microsoft.com/office/2019/extlst" xmlns:r="http://schemas.openxmlformats.org/officeDocument/2006/relationships" xmlns:m="http://schemas.openxmlformats.org/officeDocument/2006/math" xmlns:v="urn:schemas-microsoft-com:vml" xmlns:wp14="http://schemas.microsoft.com/office/word/2010/wordprocessingDrawing" xmlns:wp="http://schemas.openxmlformats.org/drawingml/2006/wordprocessingDrawing" xmlns:w10="urn:schemas-microsoft-com:office:word" xmlns:w="http://schemas.openxmlformats.org/wordprocessingml/2006/main" xmlns:w14="http://schemas.microsoft.com/office/word/2010/wordml" xmlns:w15="http://schemas.microsoft.com/office/word/2012/wordml" xmlns:w16cex="http://schemas.microsoft.com/office/word/2018/wordml/cex" xmlns:w16cid="http://schemas.microsoft.com/office/word/2016/wordml/cid" xmlns:w16="http://schemas.microsoft.com/office/word/2018/wordml" xmlns:w16du="http://schemas.microsoft.com/office/word/2023/wordml/word16du" xmlns:w16sdtdh="http://schemas.microsoft.com/office/word/2020/wordml/sdtdatahash" xmlns:w16sdtfl="http://schemas.microsoft.com/office/word/2024/wordml/sdtformatlock" xmlns:w16se="http://schemas.microsoft.com/office/word/2015/wordml/symex" xmlns:wpg="http://schemas.microsoft.com/office/word/2010/wordprocessingGroup" xmlns:wpi="http://schemas.microsoft.com/office/word/2010/wordprocessingInk" xmlns:wne="http://schemas.microsoft.com/office/word/2006/wordml" xmlns:wps="http://schemas.microsoft.com/office/word/2010/wordprocessingShape" mc:Ignorable="w14 w15 w16se w16cid w16 w16cex w16sdtdh w16sdtfl w16du wp14">
   <w:abstractNum w:abstractNumId="0" w15:restartNumberingAfterBreak="0">
     <w:nsid w:val="311771E6"/>
     <w:multiLevelType w:val="hybridMultilevel"/>
@@ -3650,7 +3716,7 @@
 </file>
 
 <file path=word/styles.xml><?xml version="1.0" encoding="utf-8"?>
-<w:styles xmlns:mc="http://schemas.openxmlformats.org/markup-compatibility/2006" xmlns:r="http://schemas.openxmlformats.org/officeDocument/2006/relationships" xmlns:w="http://schemas.openxmlformats.org/wordprocessingml/2006/main" xmlns:w14="http://schemas.microsoft.com/office/word/2010/wordml" xmlns:w15="http://schemas.microsoft.com/office/word/2012/wordml" xmlns:w16cex="http://schemas.microsoft.com/office/word/2018/wordml/cex" xmlns:w16cid="http://schemas.microsoft.com/office/word/2016/wordml/cid" xmlns:w16="http://schemas.microsoft.com/office/word/2018/wordml" xmlns:w16sdtdh="http://schemas.microsoft.com/office/word/2020/wordml/sdtdatahash" xmlns:w16sdtfl="http://schemas.microsoft.com/office/word/2024/wordml/sdtformatlock" xmlns:w16se="http://schemas.microsoft.com/office/word/2015/wordml/symex" xmlns:w16du="http://schemas.microsoft.com/office/word/2023/wordml/word16du" mc:Ignorable="w14 w15 w16se w16cid w16 w16cex w16sdtdh w16sdtfl w16du">
+<w:styles xmlns:mc="http://schemas.openxmlformats.org/markup-compatibility/2006" xmlns:r="http://schemas.openxmlformats.org/officeDocument/2006/relationships" xmlns:w="http://schemas.openxmlformats.org/wordprocessingml/2006/main" xmlns:w14="http://schemas.microsoft.com/office/word/2010/wordml" xmlns:w15="http://schemas.microsoft.com/office/word/2012/wordml" xmlns:w16cex="http://schemas.microsoft.com/office/word/2018/wordml/cex" xmlns:w16cid="http://schemas.microsoft.com/office/word/2016/wordml/cid" xmlns:w16="http://schemas.microsoft.com/office/word/2018/wordml" xmlns:w16du="http://schemas.microsoft.com/office/word/2023/wordml/word16du" xmlns:w16sdtdh="http://schemas.microsoft.com/office/word/2020/wordml/sdtdatahash" xmlns:w16sdtfl="http://schemas.microsoft.com/office/word/2024/wordml/sdtformatlock" xmlns:w16se="http://schemas.microsoft.com/office/word/2015/wordml/symex" mc:Ignorable="w14 w15 w16se w16cid w16 w16cex w16sdtdh w16sdtfl w16du">
   <w:docDefaults>
     <w:rPrDefault>
       <w:rPr>

</xml_diff>